<commit_message>
big data notes update
</commit_message>
<xml_diff>
--- a/2nd Semester/Notes/Mathematical Foundation for Data Science/Lecture Notes.docx
+++ b/2nd Semester/Notes/Mathematical Foundation for Data Science/Lecture Notes.docx
@@ -1057,6 +1057,9 @@
           </wp:inline>
         </w:drawing>
       </w:r>
+      <w:r>
+        <w:t>x</w:t>
+      </w:r>
     </w:p>
     <w:p/>
     <w:p/>
@@ -11386,7 +11389,7 @@
           <w:szCs w:val="20"/>
         </w:rPr>
         <w:pict w14:anchorId="5AC30B35">
-          <v:rect id="_x0000_i1059" style="width:0;height:.75pt" o:hralign="center" o:hrstd="t" o:hrnoshade="t" o:hr="t" fillcolor="#f8faff" stroked="f"/>
+          <v:rect id="_x0000_i1047" style="width:0;height:.75pt" o:hralign="center" o:hrstd="t" o:hrnoshade="t" o:hr="t" fillcolor="#f8faff" stroked="f"/>
         </w:pict>
       </w:r>
     </w:p>
@@ -12400,7 +12403,7 @@
           <w:szCs w:val="20"/>
         </w:rPr>
         <w:pict w14:anchorId="0791D962">
-          <v:rect id="_x0000_i1060" style="width:0;height:.75pt" o:hralign="center" o:hrstd="t" o:hrnoshade="t" o:hr="t" fillcolor="#f8faff" stroked="f"/>
+          <v:rect id="_x0000_i1048" style="width:0;height:.75pt" o:hralign="center" o:hrstd="t" o:hrnoshade="t" o:hr="t" fillcolor="#f8faff" stroked="f"/>
         </w:pict>
       </w:r>
     </w:p>
@@ -21362,6 +21365,7 @@
   <w:style w:type="character" w:default="1" w:styleId="DefaultParagraphFont">
     <w:name w:val="Default Paragraph Font"/>
     <w:uiPriority w:val="1"/>
+    <w:semiHidden/>
     <w:unhideWhenUsed/>
   </w:style>
   <w:style w:type="table" w:default="1" w:styleId="TableNormal">

</xml_diff>